<commit_message>
#7 Added links for peripheral in word DOC and PDF
</commit_message>
<xml_diff>
--- a/docs/Client-Files/Aroma oil diffuser testing guide .docx
+++ b/docs/Client-Files/Aroma oil diffuser testing guide .docx
@@ -58,7 +58,7 @@
                     </pic:cNvPicPr>
                   </pic:nvPicPr>
                   <pic:blipFill>
-                    <a:blip r:embed="rId5">
+                    <a:blip r:embed="rId6">
                       <a:extLst>
                         <a:ext uri="{28A0092B-C50C-407E-A947-70E740481C1C}">
                           <a14:useLocalDpi xmlns:a14="http://schemas.microsoft.com/office/drawing/2010/main" val="0"/>
@@ -416,18 +416,7 @@
           <w:szCs w:val="24"/>
           <w:lang w:eastAsia="en-PK"/>
         </w:rPr>
-        <w:t>Attach the</w:t>
-      </w:r>
-      <w:bookmarkStart w:id="0" w:name="_GoBack"/>
-      <w:bookmarkEnd w:id="0"/>
-      <w:r>
-        <w:rPr>
-          <w:rFonts w:eastAsia="Times New Roman" w:cstheme="minorHAnsi"/>
-          <w:sz w:val="24"/>
-          <w:szCs w:val="24"/>
-          <w:lang w:eastAsia="en-PK"/>
-        </w:rPr>
-        <w:t xml:space="preserve"> other wire to the second terminal.</w:t>
+        <w:t>Attach the other wire to the second terminal.</w:t>
       </w:r>
     </w:p>
     <w:p>
@@ -504,14 +493,142 @@
     </w:p>
     <w:p>
       <w:pPr>
+        <w:spacing w:before="100" w:beforeAutospacing="1" w:after="100" w:afterAutospacing="1" w:line="240" w:lineRule="auto"/>
+        <w:rPr>
+          <w:rFonts w:eastAsia="Times New Roman" w:cstheme="minorHAnsi"/>
+          <w:b/>
+          <w:bCs/>
+          <w:sz w:val="28"/>
+          <w:szCs w:val="24"/>
+          <w:lang w:val="en-US" w:eastAsia="en-PK"/>
+        </w:rPr>
+      </w:pPr>
+      <w:r>
+        <w:rPr>
+          <w:rFonts w:ascii="Times New Roman" w:eastAsia="Times New Roman" w:hAnsi="Times New Roman" w:cs="Times New Roman"/>
+          <w:sz w:val="24"/>
+          <w:szCs w:val="24"/>
+          <w:lang w:eastAsia="en-PK"/>
+        </w:rPr>
+        <w:br/>
+      </w:r>
+      <w:r>
+        <w:rPr>
+          <w:rFonts w:eastAsia="Times New Roman" w:cstheme="minorHAnsi"/>
+          <w:b/>
+          <w:bCs/>
+          <w:sz w:val="28"/>
+          <w:szCs w:val="24"/>
+          <w:lang w:val="en-US" w:eastAsia="en-PK"/>
+        </w:rPr>
+        <w:t>Peripheral Links:</w:t>
+      </w:r>
+    </w:p>
+    <w:p>
+      <w:pPr>
+        <w:spacing w:before="100" w:beforeAutospacing="1" w:after="100" w:afterAutospacing="1" w:line="240" w:lineRule="auto"/>
+        <w:rPr>
+          <w:rStyle w:val="Hyperlink"/>
+          <w:rFonts w:eastAsia="Times New Roman" w:cstheme="minorHAnsi"/>
+          <w:sz w:val="28"/>
+          <w:szCs w:val="24"/>
+          <w:lang w:val="en-US" w:eastAsia="en-PK"/>
+        </w:rPr>
+      </w:pPr>
+      <w:hyperlink r:id="rId7" w:history="1">
+        <w:r>
+          <w:rPr>
+            <w:rStyle w:val="Hyperlink"/>
+            <w:rFonts w:eastAsia="Times New Roman" w:cstheme="minorHAnsi"/>
+            <w:sz w:val="28"/>
+            <w:szCs w:val="24"/>
+            <w:lang w:val="en-US" w:eastAsia="en-PK"/>
+          </w:rPr>
+          <w:t>24V 2 Amp power Adapter</w:t>
+        </w:r>
+      </w:hyperlink>
+    </w:p>
+    <w:p>
+      <w:pPr>
+        <w:spacing w:before="100" w:beforeAutospacing="1" w:after="100" w:afterAutospacing="1" w:line="240" w:lineRule="auto"/>
+        <w:rPr>
+          <w:rFonts w:eastAsia="Times New Roman" w:cstheme="minorHAnsi"/>
+          <w:sz w:val="28"/>
+          <w:szCs w:val="24"/>
+          <w:lang w:val="en-US" w:eastAsia="en-PK"/>
+        </w:rPr>
+      </w:pPr>
+      <w:hyperlink r:id="rId8" w:history="1">
+        <w:r>
+          <w:rPr>
+            <w:rStyle w:val="Hyperlink"/>
+            <w:rFonts w:eastAsia="Times New Roman" w:cstheme="minorHAnsi"/>
+            <w:sz w:val="28"/>
+            <w:szCs w:val="24"/>
+            <w:lang w:val="en-US" w:eastAsia="en-PK"/>
+          </w:rPr>
+          <w:t>Toggle Switch (SPST) (On/Off)</w:t>
+        </w:r>
+      </w:hyperlink>
+    </w:p>
+    <w:p>
+      <w:pPr>
+        <w:spacing w:before="100" w:beforeAutospacing="1" w:after="100" w:afterAutospacing="1" w:line="240" w:lineRule="auto"/>
+        <w:rPr>
+          <w:rFonts w:eastAsia="Times New Roman" w:cstheme="minorHAnsi"/>
+          <w:sz w:val="28"/>
+          <w:szCs w:val="24"/>
+          <w:lang w:val="en-US" w:eastAsia="en-PK"/>
+        </w:rPr>
+      </w:pPr>
+      <w:hyperlink r:id="rId9" w:history="1">
+        <w:r>
+          <w:rPr>
+            <w:rStyle w:val="Hyperlink"/>
+            <w:rFonts w:eastAsia="Times New Roman" w:cstheme="minorHAnsi"/>
+            <w:sz w:val="28"/>
+            <w:szCs w:val="24"/>
+            <w:lang w:val="en-US" w:eastAsia="en-PK"/>
+          </w:rPr>
+          <w:t>DC 24V Blower Fan (75mm x 30mm)</w:t>
+        </w:r>
+      </w:hyperlink>
+    </w:p>
+    <w:p>
+      <w:pPr>
+        <w:spacing w:before="100" w:beforeAutospacing="1" w:after="100" w:afterAutospacing="1" w:line="240" w:lineRule="auto"/>
+        <w:rPr>
+          <w:rFonts w:eastAsia="Times New Roman" w:cstheme="minorHAnsi"/>
+          <w:sz w:val="28"/>
+          <w:szCs w:val="24"/>
+          <w:lang w:val="en-US" w:eastAsia="en-PK"/>
+        </w:rPr>
+      </w:pPr>
+      <w:hyperlink r:id="rId10" w:history="1">
+        <w:r>
+          <w:rPr>
+            <w:rStyle w:val="Hyperlink"/>
+            <w:rFonts w:eastAsia="Times New Roman" w:cstheme="minorHAnsi"/>
+            <w:sz w:val="28"/>
+            <w:szCs w:val="24"/>
+            <w:lang w:val="en-US" w:eastAsia="en-PK"/>
+          </w:rPr>
+          <w:t>D16mm 1.7MHz Ultrasonic Atomizer</w:t>
+        </w:r>
+      </w:hyperlink>
+    </w:p>
+    <w:p>
+      <w:pPr>
         <w:spacing w:after="0" w:line="240" w:lineRule="auto"/>
         <w:rPr>
           <w:rFonts w:ascii="Times New Roman" w:eastAsia="Times New Roman" w:hAnsi="Times New Roman" w:cs="Times New Roman"/>
           <w:sz w:val="24"/>
           <w:szCs w:val="24"/>
-          <w:lang w:eastAsia="en-PK"/>
-        </w:rPr>
-      </w:pPr>
+          <w:lang w:val="en-US" w:eastAsia="en-PK"/>
+        </w:rPr>
+      </w:pPr>
+      <w:bookmarkStart w:id="0" w:name="_GoBack"/>
+      <w:bookmarkEnd w:id="0"/>
     </w:p>
     <w:sectPr>
       <w:pgSz w:w="11906" w:h="16838"/>
@@ -1711,7 +1828,6 @@
   <w:style w:type="character" w:default="1" w:styleId="DefaultParagraphFont">
     <w:name w:val="Default Paragraph Font"/>
     <w:uiPriority w:val="1"/>
-    <w:semiHidden/>
     <w:unhideWhenUsed/>
   </w:style>
   <w:style w:type="table" w:default="1" w:styleId="TableNormal">
@@ -1772,6 +1888,29 @@
     <w:rPr>
       <w:b/>
       <w:bCs/>
+    </w:rPr>
+  </w:style>
+  <w:style w:type="character" w:styleId="Hyperlink">
+    <w:name w:val="Hyperlink"/>
+    <w:basedOn w:val="DefaultParagraphFont"/>
+    <w:uiPriority w:val="99"/>
+    <w:unhideWhenUsed/>
+    <w:rsid w:val="00515920"/>
+    <w:rPr>
+      <w:color w:val="0563C1" w:themeColor="hyperlink"/>
+      <w:u w:val="single"/>
+    </w:rPr>
+  </w:style>
+  <w:style w:type="character" w:styleId="FollowedHyperlink">
+    <w:name w:val="FollowedHyperlink"/>
+    <w:basedOn w:val="DefaultParagraphFont"/>
+    <w:uiPriority w:val="99"/>
+    <w:semiHidden/>
+    <w:unhideWhenUsed/>
+    <w:rsid w:val="00F339AA"/>
+    <w:rPr>
+      <w:color w:val="954F72" w:themeColor="followedHyperlink"/>
+      <w:u w:val="single"/>
     </w:rPr>
   </w:style>
 </w:styles>
@@ -2036,4 +2175,16 @@
     </a:ext>
   </a:extLst>
 </a:theme>
+</file>
+
+<file path=customXml/item1.xml><?xml version="1.0" encoding="utf-8"?>
+<b:Sources xmlns:b="http://schemas.openxmlformats.org/officeDocument/2006/bibliography" xmlns="http://schemas.openxmlformats.org/officeDocument/2006/bibliography" SelectedStyle="\APASixthEditionOfficeOnline.xsl" StyleName="APA" Version="6"/>
+</file>
+
+<file path=customXml/itemProps1.xml><?xml version="1.0" encoding="utf-8"?>
+<ds:datastoreItem xmlns:ds="http://schemas.openxmlformats.org/officeDocument/2006/customXml" ds:itemID="{17BE44A4-6CCC-4E3A-A17A-971B32C21BD4}">
+  <ds:schemaRefs>
+    <ds:schemaRef ds:uri="http://schemas.openxmlformats.org/officeDocument/2006/bibliography"/>
+  </ds:schemaRefs>
+</ds:datastoreItem>
 </file>
</xml_diff>